<commit_message>
Generando versiones para “01-S2-2025-SEDQ
</commit_message>
<xml_diff>
--- a/Lab/01-S2-2025-SEDQ/01-S2-2025-SEDQ-v1.docx
+++ b/Lab/01-S2-2025-SEDQ/01-S2-2025-SEDQ-v1.docx
@@ -5253,6 +5253,96 @@
         <w:rPr>
           <w:rStyle w:val="CommentTok"/>
         </w:rPr>
+        <w:t xml:space="preserve"># Obtener la ruta temporal para guardar la imagen</w:t>
+      </w:r>
+      <w:r>
+        <w:br/>
+      </w:r>
+      <w:r>
+        <w:rPr>
+          <w:rStyle w:val="NormalTok"/>
+        </w:rPr>
+        <w:t xml:space="preserve">temp_dir </w:t>
+      </w:r>
+      <w:r>
+        <w:rPr>
+          <w:rStyle w:val="OtherTok"/>
+        </w:rPr>
+        <w:t xml:space="preserve">&lt;-</w:t>
+      </w:r>
+      <w:r>
+        <w:rPr>
+          <w:rStyle w:val="NormalTok"/>
+        </w:rPr>
+        <w:t xml:space="preserve"> </w:t>
+      </w:r>
+      <w:r>
+        <w:rPr>
+          <w:rStyle w:val="FunctionTok"/>
+        </w:rPr>
+        <w:t xml:space="preserve">tempdir</w:t>
+      </w:r>
+      <w:r>
+        <w:rPr>
+          <w:rStyle w:val="NormalTok"/>
+        </w:rPr>
+        <w:t xml:space="preserve">()</w:t>
+      </w:r>
+      <w:r>
+        <w:br/>
+      </w:r>
+      <w:r>
+        <w:rPr>
+          <w:rStyle w:val="NormalTok"/>
+        </w:rPr>
+        <w:t xml:space="preserve">grafico_path </w:t>
+      </w:r>
+      <w:r>
+        <w:rPr>
+          <w:rStyle w:val="OtherTok"/>
+        </w:rPr>
+        <w:t xml:space="preserve">&lt;-</w:t>
+      </w:r>
+      <w:r>
+        <w:rPr>
+          <w:rStyle w:val="NormalTok"/>
+        </w:rPr>
+        <w:t xml:space="preserve"> </w:t>
+      </w:r>
+      <w:r>
+        <w:rPr>
+          <w:rStyle w:val="FunctionTok"/>
+        </w:rPr>
+        <w:t xml:space="preserve">file.path</w:t>
+      </w:r>
+      <w:r>
+        <w:rPr>
+          <w:rStyle w:val="NormalTok"/>
+        </w:rPr>
+        <w:t xml:space="preserve">(temp_dir, </w:t>
+      </w:r>
+      <w:r>
+        <w:rPr>
+          <w:rStyle w:val="StringTok"/>
+        </w:rPr>
+        <w:t xml:space="preserve">"grafico_circular"</w:t>
+      </w:r>
+      <w:r>
+        <w:rPr>
+          <w:rStyle w:val="NormalTok"/>
+        </w:rPr>
+        <w:t xml:space="preserve">)</w:t>
+      </w:r>
+      <w:r>
+        <w:br/>
+      </w:r>
+      <w:r>
+        <w:br/>
+      </w:r>
+      <w:r>
+        <w:rPr>
+          <w:rStyle w:val="CommentTok"/>
+        </w:rPr>
         <w:t xml:space="preserve"># Código Python para generar el gráfico circular</w:t>
       </w:r>
       <w:r>
@@ -5319,6 +5409,15 @@
         <w:br/>
       </w:r>
       <w:r>
+        <w:rPr>
+          <w:rStyle w:val="StringTok"/>
+        </w:rPr>
+        <w:t xml:space="preserve">import os</w:t>
+      </w:r>
+      <w:r>
+        <w:br/>
+      </w:r>
+      <w:r>
         <w:br/>
       </w:r>
       <w:r>
@@ -5667,16 +5766,25 @@
         <w:rPr>
           <w:rStyle w:val="StringTok"/>
         </w:rPr>
-        <w:t xml:space="preserve"># Guardar el gráfico</w:t>
-      </w:r>
-      <w:r>
-        <w:br/>
-      </w:r>
-      <w:r>
-        <w:rPr>
-          <w:rStyle w:val="StringTok"/>
-        </w:rPr>
-        <w:t xml:space="preserve">plt.savefig("grafico_circular.png", dpi=150, bbox_inches="tight")</w:t>
+        <w:t xml:space="preserve"># Guardar el gráfico en múltiples formatos para asegurar compatibilidad</w:t>
+      </w:r>
+      <w:r>
+        <w:br/>
+      </w:r>
+      <w:r>
+        <w:rPr>
+          <w:rStyle w:val="StringTok"/>
+        </w:rPr>
+        <w:t xml:space="preserve">plt.savefig("%s.png", dpi=150, bbox_inches="tight", format="png")</w:t>
+      </w:r>
+      <w:r>
+        <w:br/>
+      </w:r>
+      <w:r>
+        <w:rPr>
+          <w:rStyle w:val="StringTok"/>
+        </w:rPr>
+        <w:t xml:space="preserve">plt.savefig("%s.pdf", dpi=150, bbox_inches="tight", format="pdf")</w:t>
       </w:r>
       <w:r>
         <w:br/>
@@ -5727,7 +5835,16 @@
         <w:rPr>
           <w:rStyle w:val="NormalTok"/>
         </w:rPr>
-        <w:t xml:space="preserve">color_bien_transporte_y_vivienda1, color_solo_vivienda1, color_solo_vivienda2, color_solo_bien_transporte, color_bien_transporte_y_vivienda2</w:t>
+        <w:t xml:space="preserve">color_bien_transporte_y_vivienda1, color_solo_vivienda1, color_solo_vivienda2, color_solo_bien_transporte, color_bien_transporte_y_vivienda2,</w:t>
+      </w:r>
+      <w:r>
+        <w:br/>
+      </w:r>
+      <w:r>
+        <w:rPr>
+          <w:rStyle w:val="NormalTok"/>
+        </w:rPr>
+        <w:t xml:space="preserve">grafico_path, grafico_path</w:t>
       </w:r>
       <w:r>
         <w:br/>
@@ -5764,6 +5881,582 @@
           <w:rStyle w:val="NormalTok"/>
         </w:rPr>
         <w:t xml:space="preserve">(codigo_python_grafico)</w:t>
+      </w:r>
+      <w:r>
+        <w:br/>
+      </w:r>
+      <w:r>
+        <w:br/>
+      </w:r>
+      <w:r>
+        <w:rPr>
+          <w:rStyle w:val="CommentTok"/>
+        </w:rPr>
+        <w:t xml:space="preserve"># Copiar los archivos a la carpeta actual para que estén disponibles</w:t>
+      </w:r>
+      <w:r>
+        <w:br/>
+      </w:r>
+      <w:r>
+        <w:rPr>
+          <w:rStyle w:val="FunctionTok"/>
+        </w:rPr>
+        <w:t xml:space="preserve">file.copy</w:t>
+      </w:r>
+      <w:r>
+        <w:rPr>
+          <w:rStyle w:val="NormalTok"/>
+        </w:rPr>
+        <w:t xml:space="preserve">(</w:t>
+      </w:r>
+      <w:r>
+        <w:rPr>
+          <w:rStyle w:val="FunctionTok"/>
+        </w:rPr>
+        <w:t xml:space="preserve">paste0</w:t>
+      </w:r>
+      <w:r>
+        <w:rPr>
+          <w:rStyle w:val="NormalTok"/>
+        </w:rPr>
+        <w:t xml:space="preserve">(grafico_path, </w:t>
+      </w:r>
+      <w:r>
+        <w:rPr>
+          <w:rStyle w:val="StringTok"/>
+        </w:rPr>
+        <w:t xml:space="preserve">".png"</w:t>
+      </w:r>
+      <w:r>
+        <w:rPr>
+          <w:rStyle w:val="NormalTok"/>
+        </w:rPr>
+        <w:t xml:space="preserve">), </w:t>
+      </w:r>
+      <w:r>
+        <w:rPr>
+          <w:rStyle w:val="StringTok"/>
+        </w:rPr>
+        <w:t xml:space="preserve">"grafico_circular.png"</w:t>
+      </w:r>
+      <w:r>
+        <w:rPr>
+          <w:rStyle w:val="NormalTok"/>
+        </w:rPr>
+        <w:t xml:space="preserve">, </w:t>
+      </w:r>
+      <w:r>
+        <w:rPr>
+          <w:rStyle w:val="AttributeTok"/>
+        </w:rPr>
+        <w:t xml:space="preserve">overwrite =</w:t>
+      </w:r>
+      <w:r>
+        <w:rPr>
+          <w:rStyle w:val="NormalTok"/>
+        </w:rPr>
+        <w:t xml:space="preserve"> </w:t>
+      </w:r>
+      <w:r>
+        <w:rPr>
+          <w:rStyle w:val="ConstantTok"/>
+        </w:rPr>
+        <w:t xml:space="preserve">TRUE</w:t>
+      </w:r>
+      <w:r>
+        <w:rPr>
+          <w:rStyle w:val="NormalTok"/>
+        </w:rPr>
+        <w:t xml:space="preserve">)</w:t>
+      </w:r>
+    </w:p>
+    <w:p>
+      <w:pPr>
+        <w:pStyle w:val="SourceCode"/>
+      </w:pPr>
+      <w:r>
+        <w:rPr>
+          <w:rStyle w:val="VerbatimChar"/>
+        </w:rPr>
+        <w:t xml:space="preserve">## [1] TRUE</w:t>
+      </w:r>
+    </w:p>
+    <w:p>
+      <w:pPr>
+        <w:pStyle w:val="SourceCode"/>
+      </w:pPr>
+      <w:r>
+        <w:rPr>
+          <w:rStyle w:val="CommentTok"/>
+        </w:rPr>
+        <w:t xml:space="preserve"># Verificar si se generó el archivo PDF</w:t>
+      </w:r>
+      <w:r>
+        <w:br/>
+      </w:r>
+      <w:r>
+        <w:rPr>
+          <w:rStyle w:val="ControlFlowTok"/>
+        </w:rPr>
+        <w:t xml:space="preserve">if</w:t>
+      </w:r>
+      <w:r>
+        <w:rPr>
+          <w:rStyle w:val="NormalTok"/>
+        </w:rPr>
+        <w:t xml:space="preserve"> (</w:t>
+      </w:r>
+      <w:r>
+        <w:rPr>
+          <w:rStyle w:val="FunctionTok"/>
+        </w:rPr>
+        <w:t xml:space="preserve">file.exists</w:t>
+      </w:r>
+      <w:r>
+        <w:rPr>
+          <w:rStyle w:val="NormalTok"/>
+        </w:rPr>
+        <w:t xml:space="preserve">(</w:t>
+      </w:r>
+      <w:r>
+        <w:rPr>
+          <w:rStyle w:val="FunctionTok"/>
+        </w:rPr>
+        <w:t xml:space="preserve">paste0</w:t>
+      </w:r>
+      <w:r>
+        <w:rPr>
+          <w:rStyle w:val="NormalTok"/>
+        </w:rPr>
+        <w:t xml:space="preserve">(grafico_path, </w:t>
+      </w:r>
+      <w:r>
+        <w:rPr>
+          <w:rStyle w:val="StringTok"/>
+        </w:rPr>
+        <w:t xml:space="preserve">".pdf"</w:t>
+      </w:r>
+      <w:r>
+        <w:rPr>
+          <w:rStyle w:val="NormalTok"/>
+        </w:rPr>
+        <w:t xml:space="preserve">))) {</w:t>
+      </w:r>
+      <w:r>
+        <w:br/>
+      </w:r>
+      <w:r>
+        <w:rPr>
+          <w:rStyle w:val="NormalTok"/>
+        </w:rPr>
+        <w:t xml:space="preserve">  </w:t>
+      </w:r>
+      <w:r>
+        <w:rPr>
+          <w:rStyle w:val="FunctionTok"/>
+        </w:rPr>
+        <w:t xml:space="preserve">file.copy</w:t>
+      </w:r>
+      <w:r>
+        <w:rPr>
+          <w:rStyle w:val="NormalTok"/>
+        </w:rPr>
+        <w:t xml:space="preserve">(</w:t>
+      </w:r>
+      <w:r>
+        <w:rPr>
+          <w:rStyle w:val="FunctionTok"/>
+        </w:rPr>
+        <w:t xml:space="preserve">paste0</w:t>
+      </w:r>
+      <w:r>
+        <w:rPr>
+          <w:rStyle w:val="NormalTok"/>
+        </w:rPr>
+        <w:t xml:space="preserve">(grafico_path, </w:t>
+      </w:r>
+      <w:r>
+        <w:rPr>
+          <w:rStyle w:val="StringTok"/>
+        </w:rPr>
+        <w:t xml:space="preserve">".pdf"</w:t>
+      </w:r>
+      <w:r>
+        <w:rPr>
+          <w:rStyle w:val="NormalTok"/>
+        </w:rPr>
+        <w:t xml:space="preserve">), </w:t>
+      </w:r>
+      <w:r>
+        <w:rPr>
+          <w:rStyle w:val="StringTok"/>
+        </w:rPr>
+        <w:t xml:space="preserve">"grafico_circular.pdf"</w:t>
+      </w:r>
+      <w:r>
+        <w:rPr>
+          <w:rStyle w:val="NormalTok"/>
+        </w:rPr>
+        <w:t xml:space="preserve">, </w:t>
+      </w:r>
+      <w:r>
+        <w:rPr>
+          <w:rStyle w:val="AttributeTok"/>
+        </w:rPr>
+        <w:t xml:space="preserve">overwrite =</w:t>
+      </w:r>
+      <w:r>
+        <w:rPr>
+          <w:rStyle w:val="NormalTok"/>
+        </w:rPr>
+        <w:t xml:space="preserve"> </w:t>
+      </w:r>
+      <w:r>
+        <w:rPr>
+          <w:rStyle w:val="ConstantTok"/>
+        </w:rPr>
+        <w:t xml:space="preserve">TRUE</w:t>
+      </w:r>
+      <w:r>
+        <w:rPr>
+          <w:rStyle w:val="NormalTok"/>
+        </w:rPr>
+        <w:t xml:space="preserve">)</w:t>
+      </w:r>
+      <w:r>
+        <w:br/>
+      </w:r>
+      <w:r>
+        <w:rPr>
+          <w:rStyle w:val="NormalTok"/>
+        </w:rPr>
+        <w:t xml:space="preserve">} </w:t>
+      </w:r>
+      <w:r>
+        <w:rPr>
+          <w:rStyle w:val="ControlFlowTok"/>
+        </w:rPr>
+        <w:t xml:space="preserve">else</w:t>
+      </w:r>
+      <w:r>
+        <w:rPr>
+          <w:rStyle w:val="NormalTok"/>
+        </w:rPr>
+        <w:t xml:space="preserve"> {</w:t>
+      </w:r>
+      <w:r>
+        <w:br/>
+      </w:r>
+      <w:r>
+        <w:rPr>
+          <w:rStyle w:val="NormalTok"/>
+        </w:rPr>
+        <w:t xml:space="preserve">  </w:t>
+      </w:r>
+      <w:r>
+        <w:rPr>
+          <w:rStyle w:val="CommentTok"/>
+        </w:rPr>
+        <w:t xml:space="preserve"># Si no se generó el PDF, convertir el PNG a PDF usando magick</w:t>
+      </w:r>
+      <w:r>
+        <w:br/>
+      </w:r>
+      <w:r>
+        <w:rPr>
+          <w:rStyle w:val="NormalTok"/>
+        </w:rPr>
+        <w:t xml:space="preserve">  </w:t>
+      </w:r>
+      <w:r>
+        <w:rPr>
+          <w:rStyle w:val="ControlFlowTok"/>
+        </w:rPr>
+        <w:t xml:space="preserve">if</w:t>
+      </w:r>
+      <w:r>
+        <w:rPr>
+          <w:rStyle w:val="NormalTok"/>
+        </w:rPr>
+        <w:t xml:space="preserve"> (</w:t>
+      </w:r>
+      <w:r>
+        <w:rPr>
+          <w:rStyle w:val="FunctionTok"/>
+        </w:rPr>
+        <w:t xml:space="preserve">requireNamespace</w:t>
+      </w:r>
+      <w:r>
+        <w:rPr>
+          <w:rStyle w:val="NormalTok"/>
+        </w:rPr>
+        <w:t xml:space="preserve">(</w:t>
+      </w:r>
+      <w:r>
+        <w:rPr>
+          <w:rStyle w:val="StringTok"/>
+        </w:rPr>
+        <w:t xml:space="preserve">"magick"</w:t>
+      </w:r>
+      <w:r>
+        <w:rPr>
+          <w:rStyle w:val="NormalTok"/>
+        </w:rPr>
+        <w:t xml:space="preserve">, </w:t>
+      </w:r>
+      <w:r>
+        <w:rPr>
+          <w:rStyle w:val="AttributeTok"/>
+        </w:rPr>
+        <w:t xml:space="preserve">quietly =</w:t>
+      </w:r>
+      <w:r>
+        <w:rPr>
+          <w:rStyle w:val="NormalTok"/>
+        </w:rPr>
+        <w:t xml:space="preserve"> </w:t>
+      </w:r>
+      <w:r>
+        <w:rPr>
+          <w:rStyle w:val="ConstantTok"/>
+        </w:rPr>
+        <w:t xml:space="preserve">TRUE</w:t>
+      </w:r>
+      <w:r>
+        <w:rPr>
+          <w:rStyle w:val="NormalTok"/>
+        </w:rPr>
+        <w:t xml:space="preserve">)) {</w:t>
+      </w:r>
+      <w:r>
+        <w:br/>
+      </w:r>
+      <w:r>
+        <w:rPr>
+          <w:rStyle w:val="NormalTok"/>
+        </w:rPr>
+        <w:t xml:space="preserve">    img </w:t>
+      </w:r>
+      <w:r>
+        <w:rPr>
+          <w:rStyle w:val="OtherTok"/>
+        </w:rPr>
+        <w:t xml:space="preserve">&lt;-</w:t>
+      </w:r>
+      <w:r>
+        <w:rPr>
+          <w:rStyle w:val="NormalTok"/>
+        </w:rPr>
+        <w:t xml:space="preserve"> magick</w:t>
+      </w:r>
+      <w:r>
+        <w:rPr>
+          <w:rStyle w:val="SpecialCharTok"/>
+        </w:rPr>
+        <w:t xml:space="preserve">::</w:t>
+      </w:r>
+      <w:r>
+        <w:rPr>
+          <w:rStyle w:val="FunctionTok"/>
+        </w:rPr>
+        <w:t xml:space="preserve">image_read</w:t>
+      </w:r>
+      <w:r>
+        <w:rPr>
+          <w:rStyle w:val="NormalTok"/>
+        </w:rPr>
+        <w:t xml:space="preserve">(</w:t>
+      </w:r>
+      <w:r>
+        <w:rPr>
+          <w:rStyle w:val="StringTok"/>
+        </w:rPr>
+        <w:t xml:space="preserve">"grafico_circular.png"</w:t>
+      </w:r>
+      <w:r>
+        <w:rPr>
+          <w:rStyle w:val="NormalTok"/>
+        </w:rPr>
+        <w:t xml:space="preserve">)</w:t>
+      </w:r>
+      <w:r>
+        <w:br/>
+      </w:r>
+      <w:r>
+        <w:rPr>
+          <w:rStyle w:val="NormalTok"/>
+        </w:rPr>
+        <w:t xml:space="preserve">    magick</w:t>
+      </w:r>
+      <w:r>
+        <w:rPr>
+          <w:rStyle w:val="SpecialCharTok"/>
+        </w:rPr>
+        <w:t xml:space="preserve">::</w:t>
+      </w:r>
+      <w:r>
+        <w:rPr>
+          <w:rStyle w:val="FunctionTok"/>
+        </w:rPr>
+        <w:t xml:space="preserve">image_write</w:t>
+      </w:r>
+      <w:r>
+        <w:rPr>
+          <w:rStyle w:val="NormalTok"/>
+        </w:rPr>
+        <w:t xml:space="preserve">(img, </w:t>
+      </w:r>
+      <w:r>
+        <w:rPr>
+          <w:rStyle w:val="StringTok"/>
+        </w:rPr>
+        <w:t xml:space="preserve">"grafico_circular.pdf"</w:t>
+      </w:r>
+      <w:r>
+        <w:rPr>
+          <w:rStyle w:val="NormalTok"/>
+        </w:rPr>
+        <w:t xml:space="preserve">, </w:t>
+      </w:r>
+      <w:r>
+        <w:rPr>
+          <w:rStyle w:val="AttributeTok"/>
+        </w:rPr>
+        <w:t xml:space="preserve">format =</w:t>
+      </w:r>
+      <w:r>
+        <w:rPr>
+          <w:rStyle w:val="NormalTok"/>
+        </w:rPr>
+        <w:t xml:space="preserve"> </w:t>
+      </w:r>
+      <w:r>
+        <w:rPr>
+          <w:rStyle w:val="StringTok"/>
+        </w:rPr>
+        <w:t xml:space="preserve">"pdf"</w:t>
+      </w:r>
+      <w:r>
+        <w:rPr>
+          <w:rStyle w:val="NormalTok"/>
+        </w:rPr>
+        <w:t xml:space="preserve">)</w:t>
+      </w:r>
+      <w:r>
+        <w:br/>
+      </w:r>
+      <w:r>
+        <w:rPr>
+          <w:rStyle w:val="NormalTok"/>
+        </w:rPr>
+        <w:t xml:space="preserve">    </w:t>
+      </w:r>
+      <w:r>
+        <w:rPr>
+          <w:rStyle w:val="FunctionTok"/>
+        </w:rPr>
+        <w:t xml:space="preserve">message</w:t>
+      </w:r>
+      <w:r>
+        <w:rPr>
+          <w:rStyle w:val="NormalTok"/>
+        </w:rPr>
+        <w:t xml:space="preserve">(</w:t>
+      </w:r>
+      <w:r>
+        <w:rPr>
+          <w:rStyle w:val="StringTok"/>
+        </w:rPr>
+        <w:t xml:space="preserve">"Convertido PNG a PDF usando magick"</w:t>
+      </w:r>
+      <w:r>
+        <w:rPr>
+          <w:rStyle w:val="NormalTok"/>
+        </w:rPr>
+        <w:t xml:space="preserve">)</w:t>
+      </w:r>
+      <w:r>
+        <w:br/>
+      </w:r>
+      <w:r>
+        <w:rPr>
+          <w:rStyle w:val="NormalTok"/>
+        </w:rPr>
+        <w:t xml:space="preserve">  } </w:t>
+      </w:r>
+      <w:r>
+        <w:rPr>
+          <w:rStyle w:val="ControlFlowTok"/>
+        </w:rPr>
+        <w:t xml:space="preserve">else</w:t>
+      </w:r>
+      <w:r>
+        <w:rPr>
+          <w:rStyle w:val="NormalTok"/>
+        </w:rPr>
+        <w:t xml:space="preserve"> {</w:t>
+      </w:r>
+      <w:r>
+        <w:br/>
+      </w:r>
+      <w:r>
+        <w:rPr>
+          <w:rStyle w:val="NormalTok"/>
+        </w:rPr>
+        <w:t xml:space="preserve">    </w:t>
+      </w:r>
+      <w:r>
+        <w:rPr>
+          <w:rStyle w:val="FunctionTok"/>
+        </w:rPr>
+        <w:t xml:space="preserve">warning</w:t>
+      </w:r>
+      <w:r>
+        <w:rPr>
+          <w:rStyle w:val="NormalTok"/>
+        </w:rPr>
+        <w:t xml:space="preserve">(</w:t>
+      </w:r>
+      <w:r>
+        <w:rPr>
+          <w:rStyle w:val="StringTok"/>
+        </w:rPr>
+        <w:t xml:space="preserve">"No se pudo generar el archivo PDF del gráfico. Se usará PNG en su lugar."</w:t>
+      </w:r>
+      <w:r>
+        <w:rPr>
+          <w:rStyle w:val="NormalTok"/>
+        </w:rPr>
+        <w:t xml:space="preserve">)</w:t>
+      </w:r>
+      <w:r>
+        <w:br/>
+      </w:r>
+      <w:r>
+        <w:rPr>
+          <w:rStyle w:val="NormalTok"/>
+        </w:rPr>
+        <w:t xml:space="preserve">  }</w:t>
+      </w:r>
+      <w:r>
+        <w:br/>
+      </w:r>
+      <w:r>
+        <w:rPr>
+          <w:rStyle w:val="NormalTok"/>
+        </w:rPr>
+        <w:t xml:space="preserve">}</w:t>
+      </w:r>
+    </w:p>
+    <w:p>
+      <w:pPr>
+        <w:pStyle w:val="SourceCode"/>
+      </w:pPr>
+      <w:r>
+        <w:rPr>
+          <w:rStyle w:val="VerbatimChar"/>
+        </w:rPr>
+        <w:t xml:space="preserve">## [1] TRUE</w:t>
       </w:r>
     </w:p>
     <w:bookmarkStart w:id="24" w:name="question"/>
@@ -5780,19 +6473,19 @@
         <w:pStyle w:val="FirstParagraph"/>
       </w:pPr>
       <w:r>
-        <w:t xml:space="preserve">Se realizó un(a) relevamiento a un grupo de personas de una organización textil sobre el tipo de bienes que poseen. Los resultados se presentan en la gráfica.</w:t>
+        <w:t xml:space="preserve">Se realizó un(a) estudio a un grupo de personas de una institución farmacéutica sobre el tipo de bienes que poseen. Los resultados se presentan en la gráfica.</w:t>
       </w:r>
     </w:p>
     <w:p>
       <w:pPr>
-        <w:pStyle w:val="CaptionedFigure"/>
+        <w:pStyle w:val="BodyText"/>
       </w:pPr>
       <w:r>
         <w:drawing>
           <wp:inline>
-            <wp:extent cx="5334000" cy="4434943"/>
+            <wp:extent cx="5334000" cy="4429932"/>
             <wp:effectExtent b="0" l="0" r="0" t="0"/>
-            <wp:docPr descr="Gráfico circular" title="" id="21" name="Picture"/>
+            <wp:docPr descr="" title="" id="21" name="Picture"/>
             <a:graphic>
               <a:graphicData uri="http://schemas.openxmlformats.org/drawingml/2006/picture">
                 <pic:pic>
@@ -5811,7 +6504,7 @@
                   <pic:spPr bwMode="auto">
                     <a:xfrm>
                       <a:off x="0" y="0"/>
-                      <a:ext cx="5334000" cy="4434943"/>
+                      <a:ext cx="5334000" cy="4429932"/>
                     </a:xfrm>
                     <a:prstGeom prst="rect">
                       <a:avLst/>
@@ -5832,18 +6525,10 @@
     </w:p>
     <w:p>
       <w:pPr>
-        <w:pStyle w:val="ImageCaption"/>
-      </w:pPr>
-      <w:r>
-        <w:t xml:space="preserve">Gráfico circular</w:t>
-      </w:r>
-    </w:p>
-    <w:p>
-      <w:pPr>
         <w:pStyle w:val="BodyText"/>
       </w:pPr>
       <w:r>
-        <w:t xml:space="preserve">Si 48 personas de el(la) organización poseen automóvil y(e) piso, ¿cuántas personas poseen solo piso?</w:t>
+        <w:t xml:space="preserve">Si 100 personas de el(la) institución poseen vehículo y(e) inmueble, ¿cuántas personas poseen solo inmueble?</w:t>
       </w:r>
     </w:p>
     <w:bookmarkStart w:id="23" w:name="answerlist"/>
@@ -5864,7 +6549,7 @@
         </w:numPr>
       </w:pPr>
       <w:r>
-        <w:t xml:space="preserve">150</w:t>
+        <w:t xml:space="preserve">120</w:t>
       </w:r>
     </w:p>
     <w:p>
@@ -5876,7 +6561,7 @@
         </w:numPr>
       </w:pPr>
       <w:r>
-        <w:t xml:space="preserve">50</w:t>
+        <w:t xml:space="preserve">337</w:t>
       </w:r>
     </w:p>
     <w:p>
@@ -5888,7 +6573,7 @@
         </w:numPr>
       </w:pPr>
       <w:r>
-        <w:t xml:space="preserve">45</w:t>
+        <w:t xml:space="preserve">538</w:t>
       </w:r>
     </w:p>
     <w:p>
@@ -5900,7 +6585,7 @@
         </w:numPr>
       </w:pPr>
       <w:r>
-        <w:t xml:space="preserve">203</w:t>
+        <w:t xml:space="preserve">118</w:t>
       </w:r>
     </w:p>
     <w:bookmarkEnd w:id="23"/>
@@ -5939,7 +6624,7 @@
         </w:numPr>
       </w:pPr>
       <w:r>
-        <w:t xml:space="preserve">24% de las personas tienen automóvil y piso</w:t>
+        <w:t xml:space="preserve">22% de las personas tienen vehículo y inmueble</w:t>
       </w:r>
     </w:p>
     <w:p>
@@ -5951,7 +6636,7 @@
         </w:numPr>
       </w:pPr>
       <w:r>
-        <w:t xml:space="preserve">25% de las personas tienen solo piso (este es el dato que buscamos)</w:t>
+        <w:t xml:space="preserve">26% de las personas tienen solo inmueble (este es el dato que buscamos)</w:t>
       </w:r>
     </w:p>
     <w:p>
@@ -5963,7 +6648,7 @@
         </w:numPr>
       </w:pPr>
       <w:r>
-        <w:t xml:space="preserve">Sabemos que 48 personas tienen automóvil y piso</w:t>
+        <w:t xml:space="preserve">Sabemos que 100 personas tienen vehículo y inmueble</w:t>
       </w:r>
     </w:p>
     <w:p>
@@ -5971,13 +6656,13 @@
         <w:pStyle w:val="FirstParagraph"/>
       </w:pPr>
       <w:r>
-        <w:t xml:space="preserve">Paso 1: Calcular el número total de personas en la organización.</w:t>
+        <w:t xml:space="preserve">Paso 1: Calcular el número total de personas en la institución.</w:t>
       </w:r>
       <w:r>
         <w:t xml:space="preserve"> </w:t>
       </w:r>
       <w:r>
-        <w:t xml:space="preserve">Si 48 personas representan el 24% del total, entonces:</w:t>
+        <w:t xml:space="preserve">Si 100 personas representan el 22% del total, entonces:</w:t>
       </w:r>
     </w:p>
     <w:p>
@@ -6012,7 +6697,7 @@
                   <m:nor/>
                   <m:sty m:val="p"/>
                 </m:rPr>
-                <m:t>Personas con automóvil y piso</m:t>
+                <m:t>Personas con vehículo y inmueble</m:t>
               </m:r>
               <m:r>
                 <m:rPr>
@@ -6036,7 +6721,7 @@
                   <m:nor/>
                   <m:sty m:val="p"/>
                 </m:rPr>
-                <m:t>Porcentaje de personas con automóvil y piso</m:t>
+                <m:t>Porcentaje de personas con vehículo y inmueble</m:t>
               </m:r>
             </m:den>
           </m:f>
@@ -6071,7 +6756,7 @@
             </m:fPr>
             <m:num>
               <m:r>
-                <m:t>48</m:t>
+                <m:t>100</m:t>
               </m:r>
               <m:r>
                 <m:rPr>
@@ -6091,7 +6776,7 @@
             </m:num>
             <m:den>
               <m:r>
-                <m:t>24</m:t>
+                <m:t>22</m:t>
               </m:r>
               <m:r>
                 <m:rPr>
@@ -6108,7 +6793,7 @@
             <m:t>=</m:t>
           </m:r>
           <m:r>
-            <m:t>200</m:t>
+            <m:t>455</m:t>
           </m:r>
         </m:oMath>
       </m:oMathPara>
@@ -6118,13 +6803,13 @@
         <w:pStyle w:val="FirstParagraph"/>
       </w:pPr>
       <w:r>
-        <w:t xml:space="preserve">Paso 2: Calcular cuántas personas tienen solo piso.</w:t>
+        <w:t xml:space="preserve">Paso 2: Calcular cuántas personas tienen solo inmueble.</w:t>
       </w:r>
       <w:r>
         <w:t xml:space="preserve"> </w:t>
       </w:r>
       <w:r>
-        <w:t xml:space="preserve">El porcentaje de personas que tienen solo piso es 25% del total, por lo tanto:</w:t>
+        <w:t xml:space="preserve">El porcentaje de personas que tienen solo inmueble es 26% del total, por lo tanto:</w:t>
       </w:r>
     </w:p>
     <w:p>
@@ -6141,7 +6826,7 @@
               <m:nor/>
               <m:sty m:val="p"/>
             </m:rPr>
-            <m:t>Personas con solo piso</m:t>
+            <m:t>Personas con solo inmueble</m:t>
           </m:r>
           <m:r>
             <m:rPr>
@@ -6172,7 +6857,7 @@
                   <m:nor/>
                   <m:sty m:val="p"/>
                 </m:rPr>
-                <m:t>Porcentaje de personas con solo piso</m:t>
+                <m:t>Porcentaje de personas con solo inmueble</m:t>
               </m:r>
             </m:num>
             <m:den>
@@ -6204,7 +6889,7 @@
               <m:nor/>
               <m:sty m:val="p"/>
             </m:rPr>
-            <m:t>Personas con solo piso</m:t>
+            <m:t>Personas con solo inmueble</m:t>
           </m:r>
           <m:r>
             <m:rPr>
@@ -6213,7 +6898,7 @@
             <m:t>=</m:t>
           </m:r>
           <m:r>
-            <m:t>200</m:t>
+            <m:t>455</m:t>
           </m:r>
           <m:r>
             <m:rPr>
@@ -6227,7 +6912,7 @@
             </m:fPr>
             <m:num>
               <m:r>
-                <m:t>25</m:t>
+                <m:t>26</m:t>
               </m:r>
               <m:r>
                 <m:rPr>
@@ -6255,7 +6940,7 @@
             <m:t>=</m:t>
           </m:r>
           <m:r>
-            <m:t>50</m:t>
+            <m:t>118</m:t>
           </m:r>
         </m:oMath>
       </m:oMathPara>
@@ -6265,7 +6950,7 @@
         <w:pStyle w:val="FirstParagraph"/>
       </w:pPr>
       <w:r>
-        <w:t xml:space="preserve">Por lo tanto, 50 personas poseen solo piso.</w:t>
+        <w:t xml:space="preserve">Por lo tanto, 118 personas poseen solo inmueble.</w:t>
       </w:r>
     </w:p>
     <w:bookmarkStart w:id="25" w:name="answerlist-1"/>
@@ -6298,7 +6983,7 @@
         </w:numPr>
       </w:pPr>
       <w:r>
-        <w:t xml:space="preserve">Verdadero</w:t>
+        <w:t xml:space="preserve">Falso</w:t>
       </w:r>
     </w:p>
     <w:p>
@@ -6322,7 +7007,7 @@
         </w:numPr>
       </w:pPr>
       <w:r>
-        <w:t xml:space="preserve">Falso</w:t>
+        <w:t xml:space="preserve">Verdadero</w:t>
       </w:r>
     </w:p>
     <w:bookmarkEnd w:id="25"/>
@@ -6353,7 +7038,7 @@
         <w:t xml:space="preserve"> </w:t>
       </w:r>
       <w:r>
-        <w:t xml:space="preserve">exsolution: 0100</w:t>
+        <w:t xml:space="preserve">exsolution: 0001</w:t>
       </w:r>
       <w:r>
         <w:t xml:space="preserve"> </w:t>
@@ -6372,36 +7057,6 @@
       </w:r>
       <w:r>
         <w:t xml:space="preserve">extol: 0</w:t>
-      </w:r>
-      <w:r>
-        <w:t xml:space="preserve"> </w:t>
-      </w:r>
-      <w:r>
-        <w:t xml:space="preserve">exextra[tipoicfes]: SAI</w:t>
-      </w:r>
-      <w:r>
-        <w:t xml:space="preserve"> </w:t>
-      </w:r>
-      <w:r>
-        <w:t xml:space="preserve">exextra[nivel]: Básico</w:t>
-      </w:r>
-      <w:r>
-        <w:t xml:space="preserve"> </w:t>
-      </w:r>
-      <w:r>
-        <w:t xml:space="preserve">exextra[componente]: Aleatorio</w:t>
-      </w:r>
-      <w:r>
-        <w:t xml:space="preserve"> </w:t>
-      </w:r>
-      <w:r>
-        <w:t xml:space="preserve">exextra[competencia]: Interpretación y representación</w:t>
-      </w:r>
-      <w:r>
-        <w:t xml:space="preserve"> </w:t>
-      </w:r>
-      <w:r>
-        <w:t xml:space="preserve">exextra[tema]: Interpretación de gráficos circulares</w:t>
       </w:r>
     </w:p>
     <w:bookmarkEnd w:id="27"/>
@@ -6711,7 +7366,7 @@
   </w:style>
   <w:style w:styleId="Subtitle" w:type="paragraph">
     <w:name w:val="Subtitle"/>
-    <w:basedOn w:val="Title"/>
+    <w:basedOn w:val="Normal"/>
     <w:next w:val="BodyText"/>
     <w:link w:val="SubtitleChar"/>
     <w:uiPriority w:val="11"/>
@@ -6724,6 +7379,7 @@
     </w:pPr>
     <w:rPr>
       <w:rFonts w:cstheme="majorBidi" w:eastAsiaTheme="majorEastAsia"/>
+      <w:color w:themeColor="text1" w:themeTint="A6" w:val="595959"/>
       <w:spacing w:val="15"/>
       <w:sz w:val="28"/>
       <w:szCs w:val="28"/>
@@ -6776,6 +7432,7 @@
     </w:pPr>
     <w:rPr>
       <w:b/>
+      <w:color w:val="345A8A"/>
       <w:sz w:val="20"/>
       <w:szCs w:val="20"/>
     </w:rPr>

</xml_diff>